<commit_message>
add finale cv upload
</commit_message>
<xml_diff>
--- a/media/Dimas_CV_ATS_Newest Indo - Copy.docx
+++ b/media/Dimas_CV_ATS_Newest Indo - Copy.docx
@@ -3011,6 +3011,24 @@
         </w:rPr>
         <w:t>Team Leader</w:t>
       </w:r>
+      <w:r>
+        <w:rPr>
+          <w:rFonts w:ascii="Arial"/>
+          <w:i/>
+          <w:color w:val="000000" w:themeColor="text1"/>
+          <w:sz w:val="18"/>
+        </w:rPr>
+        <w:t xml:space="preserve"> </w:t>
+      </w:r>
+      <w:r>
+        <w:rPr>
+          <w:rFonts w:ascii="Arial"/>
+          <w:i/>
+          <w:color w:val="000000" w:themeColor="text1"/>
+          <w:sz w:val="18"/>
+        </w:rPr>
+        <w:t>and Full-Stack Developer</w:t>
+      </w:r>
     </w:p>
     <w:p>
       <w:pPr>
@@ -6004,7 +6022,7 @@
         <v:path o:extrusionok="f" gradientshapeok="t" o:connecttype="rect"/>
         <o:lock v:ext="edit" aspectratio="t"/>
       </v:shapetype>
-      <v:shape id="_x0000_i1025" type="#_x0000_t75" style="width:6.1pt;height:6.1pt" o:bullet="t">
+      <v:shape id="_x0000_i1025" type="#_x0000_t75" style="width:6.25pt;height:6.25pt" o:bullet="t">
         <v:imagedata r:id="rId1" o:title="image1"/>
       </v:shape>
     </w:pict>

</xml_diff>